<commit_message>
docs: actualizar memoria v4.2 y plan comercial (0.0.125)
Alinea documentacion con QA, Laboratorio /qa-lab, notificaciones archivadas, piloto 25/50 y guion demo comercial jun 2026.

Co-authored-by: Cursor <cursoragent@cursor.com>
</commit_message>
<xml_diff>
--- a/docs/Journey-Usuario-Uber-Truck.docx
+++ b/docs/Journey-Usuario-Uber-Truck.docx
@@ -51,13 +51,13 @@
       </w:r>
       <w:r>
         <w:rPr/>
-        <w:t xml:space="preserve"> 2.9 · 25 may 2026 · Software app </w:t>
+        <w:t xml:space="preserve"> 3.0 · 10 jun 2026 · Software app </w:t>
       </w:r>
       <w:r>
         <w:rPr>
           <w:b/>
         </w:rPr>
-        <w:t xml:space="preserve">0.0.105</w:t>
+        <w:t xml:space="preserve">0.0.125</w:t>
       </w:r>
       <w:r>
         <w:rPr/>
@@ -71,7 +71,7 @@
       </w:r>
       <w:r>
         <w:rPr/>
-        <w:t xml:space="preserve"> (web PWA + APK Android)</w:t>
+        <w:t xml:space="preserve"> (web PWA + APK Android Capacitor)</w:t>
       </w:r>
     </w:p>
     <w:p>
@@ -265,7 +265,7 @@
             </w:pPr>
             <w:r>
               <w:rPr/>
-              <w:t xml:space="preserve">APK instalado o PWA desde navegador</w:t>
+              <w:t xml:space="preserve">APK remoto (siempre prod) o bundle firmado para piloto</w:t>
             </w:r>
           </w:p>
         </w:tc>
@@ -286,16 +286,36 @@
               <w:rPr>
                 <w:highlight w:val="lightGray"/>
               </w:rPr>
-              <w:t xml:space="preserve">%USERPROFILE%\Downloads\cubik-android.apk</w:t>
-            </w:r>
-          </w:p>
-          <w:p>
-            <w:pPr>
-              <w:spacing w:lineRule="auto"/>
-            </w:pPr>
-            <w:r>
-              <w:rPr/>
-              <w:t xml:space="preserve"> o </w:t>
+              <w:t xml:space="preserve">npm run android:install:remote</w:t>
+            </w:r>
+          </w:p>
+          <w:p>
+            <w:pPr>
+              <w:spacing w:lineRule="auto"/>
+            </w:pPr>
+            <w:r>
+              <w:rPr/>
+              <w:t xml:space="preserve"> · </w:t>
+            </w:r>
+          </w:p>
+          <w:p>
+            <w:pPr>
+              <w:spacing w:lineRule="auto"/>
+            </w:pPr>
+            <w:r>
+              <w:rPr>
+                <w:highlight w:val="lightGray"/>
+              </w:rPr>
+              <w:t xml:space="preserve">cubik-android.apk</w:t>
+            </w:r>
+          </w:p>
+          <w:p>
+            <w:pPr>
+              <w:spacing w:lineRule="auto"/>
+            </w:pPr>
+            <w:r>
+              <w:rPr/>
+              <w:t xml:space="preserve"> · </w:t>
             </w:r>
           </w:p>
           <w:p>
@@ -7605,7 +7625,7 @@
       </w:pPr>
       <w:r>
         <w:rPr/>
-        <w:t xml:space="preserve">12. Corredor y liquidez (piloto M2)</w:t>
+        <w:t xml:space="preserve">14. Notificaciones (v0.0.125)</w:t>
       </w:r>
     </w:p>
     <w:p>
@@ -7620,11 +7640,11 @@
         <w:rPr>
           <w:b/>
         </w:rPr>
-        <w:t xml:space="preserve">Enfoque:</w:t>
-      </w:r>
-      <w:r>
-        <w:rPr/>
-        <w:t xml:space="preserve"> RM (origen) ↔ Valparaíso / San Antonio — no dispersar el piloto en rutas sin densidad.</w:t>
+        <w:t xml:space="preserve">Activas:</w:t>
+      </w:r>
+      <w:r>
+        <w:rPr/>
+        <w:t xml:space="preserve"> campana muestra solo notificaciones de viajes abiertos o accionables.</w:t>
       </w:r>
     </w:p>
     <w:p>
@@ -7639,11 +7659,11 @@
         <w:rPr>
           <w:b/>
         </w:rPr>
-        <w:t xml:space="preserve">Semanal:</w:t>
-      </w:r>
-      <w:r>
-        <w:rPr/>
-        <w:t xml:space="preserve"> al menos 3 cargas y 2 ofertas activas en el mismo corredor.</w:t>
+        <w:t xml:space="preserve">Historial:</w:t>
+      </w:r>
+      <w:r>
+        <w:rPr/>
+        <w:t xml:space="preserve"> al completar o cancelar un match, las notificaciones pasan a historial (no molestan en activos).</w:t>
       </w:r>
     </w:p>
     <w:p>
@@ -7658,6 +7678,104 @@
         <w:rPr>
           <w:b/>
         </w:rPr>
+        <w:t xml:space="preserve">Chat:</w:t>
+      </w:r>
+      <w:r>
+        <w:rPr/>
+        <w:t xml:space="preserve"> bloqueado si el emparejamiento está cerrado.</w:t>
+      </w:r>
+    </w:p>
+    <w:p>
+      <w:pPr>
+        <w:pStyle w:val="Heading2"/>
+        <w:spacing w:lineRule="auto"/>
+      </w:pPr>
+      <w:r>
+        <w:rPr/>
+        <w:t xml:space="preserve">15. Piloto comercial (25 empresas + 50 transportistas)</w:t>
+      </w:r>
+    </w:p>
+    <w:p>
+      <w:pPr>
+        <w:spacing w:lineRule="auto"/>
+      </w:pPr>
+      <w:r>
+        <w:rPr/>
+        <w:t xml:space="preserve">Fase posterior a la demo comercial jun 2026. Mismo stack Capacitor híbrido; onboarding curado; corredor RM ↔ Valparaíso/San Antonio. Detalle: </w:t>
+      </w:r>
+      <w:hyperlink r:id="rId29">
+        <w:r>
+          <w:rPr>
+            <w:rStyle w:val="Hyperlink"/>
+          </w:rPr>
+          <w:t xml:space="preserve">PLAN-COMERCIAL-PILOTO.md</w:t>
+        </w:r>
+      </w:hyperlink>
+      <w:r>
+        <w:rPr/>
+        <w:t xml:space="preserve">.</w:t>
+      </w:r>
+    </w:p>
+    <w:p>
+      <w:pPr>
+        <w:pStyle w:val="Heading2"/>
+        <w:spacing w:lineRule="auto"/>
+      </w:pPr>
+      <w:r>
+        <w:rPr/>
+        <w:t xml:space="preserve">16. Corredor y liquidez (piloto M2)</w:t>
+      </w:r>
+    </w:p>
+    <w:p>
+      <w:pPr>
+        <w:numPr>
+          <w:ilvl w:val="0"/>
+          <w:numId w:val="10"/>
+        </w:numPr>
+        <w:spacing w:lineRule="auto"/>
+      </w:pPr>
+      <w:r>
+        <w:rPr>
+          <w:b/>
+        </w:rPr>
+        <w:t xml:space="preserve">Enfoque:</w:t>
+      </w:r>
+      <w:r>
+        <w:rPr/>
+        <w:t xml:space="preserve"> RM (origen) ↔ Valparaíso / San Antonio — no dispersar el piloto en rutas sin densidad.</w:t>
+      </w:r>
+    </w:p>
+    <w:p>
+      <w:pPr>
+        <w:numPr>
+          <w:ilvl w:val="0"/>
+          <w:numId w:val="10"/>
+        </w:numPr>
+        <w:spacing w:lineRule="auto"/>
+      </w:pPr>
+      <w:r>
+        <w:rPr>
+          <w:b/>
+        </w:rPr>
+        <w:t xml:space="preserve">Semanal:</w:t>
+      </w:r>
+      <w:r>
+        <w:rPr/>
+        <w:t xml:space="preserve"> al menos 3 cargas y 2 ofertas activas en el mismo corredor.</w:t>
+      </w:r>
+    </w:p>
+    <w:p>
+      <w:pPr>
+        <w:numPr>
+          <w:ilvl w:val="0"/>
+          <w:numId w:val="10"/>
+        </w:numPr>
+        <w:spacing w:lineRule="auto"/>
+      </w:pPr>
+      <w:r>
+        <w:rPr>
+          <w:b/>
+        </w:rPr>
         <w:t xml:space="preserve">Éxito M2:</w:t>
       </w:r>
       <w:r>
@@ -7680,7 +7798,7 @@
       </w:pPr>
       <w:r>
         <w:rPr/>
-        <w:t xml:space="preserve">13. KPIs marketplace (20 viajes)</w:t>
+        <w:t xml:space="preserve">17. KPIs marketplace (20 viajes)</w:t>
       </w:r>
     </w:p>
     <w:tbl>
@@ -8090,7 +8208,7 @@
         <w:rPr/>
         <w:t xml:space="preserve">Definiciones y fuente de datos: </w:t>
       </w:r>
-      <w:hyperlink r:id="rId29">
+      <w:hyperlink r:id="rId30">
         <w:r>
           <w:rPr>
             <w:rStyle w:val="Hyperlink"/>
@@ -8110,7 +8228,7 @@
       </w:pPr>
       <w:r>
         <w:rPr/>
-        <w:t xml:space="preserve">14. Riesgos y quién responde (resumen)</w:t>
+        <w:t xml:space="preserve">18. Riesgos y quién responde (resumen)</w:t>
       </w:r>
     </w:p>
     <w:p>
@@ -8140,7 +8258,7 @@
         <w:rPr/>
         <w:t xml:space="preserve">Matriz completa y tabla de cobertura: </w:t>
       </w:r>
-      <w:hyperlink r:id="rId30">
+      <w:hyperlink r:id="rId31">
         <w:r>
           <w:rPr>
             <w:rStyle w:val="Hyperlink"/>
@@ -8152,7 +8270,7 @@
         <w:rPr/>
         <w:t xml:space="preserve"> · </w:t>
       </w:r>
-      <w:hyperlink r:id="rId31">
+      <w:hyperlink r:id="rId32">
         <w:r>
           <w:rPr>
             <w:rStyle w:val="Hyperlink"/>
@@ -8173,7 +8291,7 @@
         <w:rPr/>
         <w:t xml:space="preserve">Modelo de negocio: </w:t>
       </w:r>
-      <w:hyperlink r:id="rId32">
+      <w:hyperlink r:id="rId33">
         <w:r>
           <w:rPr>
             <w:rStyle w:val="Hyperlink"/>
@@ -8185,36 +8303,24 @@
         <w:rPr/>
         <w:t xml:space="preserve"> · Gantt y backlog: </w:t>
       </w:r>
-      <w:hyperlink r:id="rId33">
-        <w:r>
-          <w:rPr>
-            <w:rStyle w:val="Hyperlink"/>
-          </w:rPr>
-          <w:t xml:space="preserve">Memoria técnica v3.6</w:t>
-        </w:r>
-      </w:hyperlink>
-      <w:r>
-        <w:rPr/>
-        <w:t xml:space="preserve"> · Multas: </w:t>
-      </w:r>
       <w:hyperlink r:id="rId34">
         <w:r>
           <w:rPr>
             <w:rStyle w:val="Hyperlink"/>
           </w:rPr>
-          <w:t xml:space="preserve">PENALTY-AND-SUPPORT.md</w:t>
+          <w:t xml:space="preserve">Memoria técnica v4.2</w:t>
         </w:r>
       </w:hyperlink>
       <w:r>
         <w:rPr/>
-        <w:t xml:space="preserve"> · Auth/correo: </w:t>
+        <w:t xml:space="preserve"> · QA: </w:t>
       </w:r>
       <w:hyperlink r:id="rId35">
         <w:r>
           <w:rPr>
             <w:rStyle w:val="Hyperlink"/>
           </w:rPr>
-          <w:t xml:space="preserve">AUTH-AND-EMAIL-ROADMAP.md</w:t>
+          <w:t xml:space="preserve">QA-AUTOMATIZADO.md</w:t>
         </w:r>
       </w:hyperlink>
       <w:r>
@@ -8236,7 +8342,7 @@
       </w:pPr>
       <w:r>
         <w:rPr/>
-        <w:t xml:space="preserve">Fin del documento — v2.8 (25 may 2026): v0.0.98 paridad Uber; diseño Cubik Saldo 10%+5%, retención en ruta, tier $1M, checkout tipo Uber Eats; implementación pagos próxima semana.</w:t>
+        <w:t xml:space="preserve">Fin del documento — v3.0 (10 jun 2026): v0.0.125 notificaciones archivadas; QA Laboratorio /qa-lab; APK remoto; plan comercial piloto 25/50; Cubik Saldo piloto 10/5 operativo.</w:t>
       </w:r>
     </w:p>
   </w:body>
@@ -9102,6 +9208,128 @@
     </w:lvl>
   </w:abstractNum>
   <w:abstractNum w:abstractNumId="9">
+    <w:lvl w:ilvl="0">
+      <w:start w:val="1"/>
+      <w:numFmt w:val="bullet"/>
+      <w:lvlText w:val=""/>
+      <w:lvlJc w:val="left"/>
+      <w:pPr>
+        <w:tabs>
+          <w:tab w:val="num" w:pos="720"/>
+        </w:tabs>
+        <w:ind w:left="720" w:hanging="360"/>
+      </w:pPr>
+      <w:rPr>
+        <w:rFonts w:ascii="Symbol" w:hAnsi="Symbol" w:hint="default"/>
+      </w:rPr>
+    </w:lvl>
+    <w:lvl w:ilvl="1">
+      <w:start w:val="1"/>
+      <w:numFmt w:val="bullet"/>
+      <w:lvlText w:val=""/>
+      <w:lvlJc w:val="left"/>
+      <w:pPr>
+        <w:tabs>
+          <w:tab w:val="num" w:pos="1440"/>
+        </w:tabs>
+        <w:ind w:left="1440" w:hanging="360"/>
+      </w:pPr>
+      <w:rPr>
+        <w:rFonts w:ascii="Symbol" w:hAnsi="Symbol" w:hint="default"/>
+      </w:rPr>
+    </w:lvl>
+    <w:lvl w:ilvl="2">
+      <w:start w:val="1"/>
+      <w:numFmt w:val="bullet"/>
+      <w:lvlText w:val=""/>
+      <w:lvlJc w:val="left"/>
+      <w:pPr>
+        <w:tabs>
+          <w:tab w:val="num" w:pos="2160"/>
+        </w:tabs>
+        <w:ind w:left="2160" w:hanging="360"/>
+      </w:pPr>
+      <w:rPr>
+        <w:rFonts w:ascii="Symbol" w:hAnsi="Symbol" w:hint="default"/>
+      </w:rPr>
+    </w:lvl>
+    <w:lvl w:ilvl="3">
+      <w:start w:val="1"/>
+      <w:numFmt w:val="bullet"/>
+      <w:lvlText w:val=""/>
+      <w:lvlJc w:val="left"/>
+      <w:pPr>
+        <w:tabs>
+          <w:tab w:val="num" w:pos="2880"/>
+        </w:tabs>
+        <w:ind w:left="2880" w:hanging="360"/>
+      </w:pPr>
+      <w:rPr>
+        <w:rFonts w:ascii="Symbol" w:hAnsi="Symbol" w:hint="default"/>
+      </w:rPr>
+    </w:lvl>
+    <w:lvl w:ilvl="4">
+      <w:start w:val="1"/>
+      <w:numFmt w:val="bullet"/>
+      <w:lvlText w:val=""/>
+      <w:lvlJc w:val="left"/>
+      <w:pPr>
+        <w:tabs>
+          <w:tab w:val="num" w:pos="3600"/>
+        </w:tabs>
+        <w:ind w:left="3600" w:hanging="360"/>
+      </w:pPr>
+      <w:rPr>
+        <w:rFonts w:ascii="Symbol" w:hAnsi="Symbol" w:hint="default"/>
+      </w:rPr>
+    </w:lvl>
+    <w:lvl w:ilvl="5">
+      <w:start w:val="1"/>
+      <w:numFmt w:val="bullet"/>
+      <w:lvlText w:val=""/>
+      <w:lvlJc w:val="left"/>
+      <w:pPr>
+        <w:tabs>
+          <w:tab w:val="num" w:pos="4320"/>
+        </w:tabs>
+        <w:ind w:left="4320" w:hanging="360"/>
+      </w:pPr>
+      <w:rPr>
+        <w:rFonts w:ascii="Symbol" w:hAnsi="Symbol" w:hint="default"/>
+      </w:rPr>
+    </w:lvl>
+    <w:lvl w:ilvl="6">
+      <w:start w:val="1"/>
+      <w:numFmt w:val="bullet"/>
+      <w:lvlText w:val=""/>
+      <w:lvlJc w:val="left"/>
+      <w:pPr>
+        <w:tabs>
+          <w:tab w:val="num" w:pos="5040"/>
+        </w:tabs>
+        <w:ind w:left="5040" w:hanging="360"/>
+      </w:pPr>
+      <w:rPr>
+        <w:rFonts w:ascii="Symbol" w:hAnsi="Symbol" w:hint="default"/>
+      </w:rPr>
+    </w:lvl>
+    <w:lvl w:ilvl="7">
+      <w:start w:val="1"/>
+      <w:numFmt w:val="bullet"/>
+      <w:lvlText w:val=""/>
+      <w:lvlJc w:val="left"/>
+      <w:pPr>
+        <w:tabs>
+          <w:tab w:val="num" w:pos="5760"/>
+        </w:tabs>
+        <w:ind w:left="5760" w:hanging="360"/>
+      </w:pPr>
+      <w:rPr>
+        <w:rFonts w:ascii="Symbol" w:hAnsi="Symbol" w:hint="default"/>
+      </w:rPr>
+    </w:lvl>
+  </w:abstractNum>
+  <w:abstractNum w:abstractNumId="10">
     <w:lvl w:ilvl="0">
       <w:start w:val="1"/>
       <w:numFmt w:val="bullet"/>
@@ -9249,6 +9477,9 @@
   </w:num>
   <w:num w:numId="9">
     <w:abstractNumId w:val="9"/>
+  </w:num>
+  <w:num w:numId="10">
+    <w:abstractNumId w:val="10"/>
   </w:num>
 </w:numbering>
 </file>

</xml_diff>